<commit_message>
fix: plantillas certificado/poder a oficio con paréntesis y negritas
Alinea CERTIFICADO_DE_DEUDA.docx y PODER.docx al ejemplo emitido:
hoja oficio 8.5×13, interlineado single sin after/before, ((campos))
en plantilla y negritas selectivas en cuerpo. Test de regresión de formato.

Co-authored-by: ParedesD28 <ParedesD28@users.noreply.github.com>
</commit_message>
<xml_diff>
--- a/static/plantillas/CERTIFICADO_DE_DEUDA.docx
+++ b/static/plantillas/CERTIFICADO_DE_DEUDA.docx
@@ -4,7 +4,7 @@
   <w:body>
     <w:p>
       <w:pPr>
-        <w:spacing w:after="0"/>
+        <w:spacing w:after="0" w:before="0" w:line="240" w:lineRule="auto"/>
         <w:jc w:val="center"/>
         <w:rPr>
           <w:rFonts w:ascii="Century Gothic" w:hAnsi="Century Gothic"/>
@@ -14,16 +14,15 @@
       </w:pPr>
       <w:r>
         <w:rPr>
-          <w:rFonts w:ascii="Century Gothic" w:hAnsi="Century Gothic"/>
+          <w:rFonts w:ascii="Century Gothic" w:hAnsi="Century Gothic" w:cs="Century Gothic" w:eastAsia="Century Gothic"/>
           <w:b/>
-          <w:bCs/>
         </w:rPr>
         <w:t>CERTIFICADO DE DEUDA</w:t>
       </w:r>
     </w:p>
     <w:p>
       <w:pPr>
-        <w:spacing w:after="0"/>
+        <w:spacing w:after="0" w:before="0" w:line="240" w:lineRule="auto"/>
         <w:jc w:val="center"/>
         <w:rPr>
           <w:rFonts w:ascii="Century Gothic" w:hAnsi="Century Gothic"/>
@@ -33,15 +32,29 @@
       </w:pPr>
       <w:r>
         <w:rPr>
-          <w:rFonts w:ascii="Century Gothic" w:hAnsi="Century Gothic" w:cs="Century Gothic"/>
+          <w:rFonts w:ascii="Century Gothic" w:hAnsi="Century Gothic" w:cs="Century Gothic" w:eastAsia="Century Gothic"/>
           <w:b/>
         </w:rPr>
+        <w:t>((</w:t>
+      </w:r>
+      <w:r>
+        <w:rPr>
+          <w:rFonts w:ascii="Century Gothic" w:hAnsi="Century Gothic" w:cs="Century Gothic" w:eastAsia="Century Gothic"/>
+          <w:b/>
+        </w:rPr>
         <w:t>{{ copropiedad_nombre }} PROPIEDAD HORIZONTAL</w:t>
+      </w:r>
+      <w:r>
+        <w:rPr>
+          <w:rFonts w:ascii="Century Gothic" w:hAnsi="Century Gothic" w:cs="Century Gothic" w:eastAsia="Century Gothic"/>
+          <w:b/>
+        </w:rPr>
+        <w:t>))</w:t>
       </w:r>
     </w:p>
     <w:p>
       <w:pPr>
-        <w:spacing w:after="0"/>
+        <w:spacing w:after="0" w:before="0" w:line="240" w:lineRule="auto"/>
         <w:jc w:val="center"/>
         <w:rPr>
           <w:rFonts w:ascii="Century Gothic" w:hAnsi="Century Gothic"/>
@@ -51,15 +64,29 @@
       </w:pPr>
       <w:r>
         <w:rPr>
-          <w:rFonts w:ascii="Century Gothic" w:hAnsi="Century Gothic" w:cs="Century Gothic"/>
+          <w:rFonts w:ascii="Century Gothic" w:hAnsi="Century Gothic" w:cs="Century Gothic" w:eastAsia="Century Gothic"/>
           <w:b/>
         </w:rPr>
-        <w:t>N.I.T.: {{ copropiedad_nit }}</w:t>
+        <w:t>N.I.T.: ((</w:t>
+      </w:r>
+      <w:r>
+        <w:rPr>
+          <w:rFonts w:ascii="Century Gothic" w:hAnsi="Century Gothic" w:cs="Century Gothic" w:eastAsia="Century Gothic"/>
+          <w:b/>
+        </w:rPr>
+        <w:t>{{ copropiedad_nit }}</w:t>
+      </w:r>
+      <w:r>
+        <w:rPr>
+          <w:rFonts w:ascii="Century Gothic" w:hAnsi="Century Gothic" w:cs="Century Gothic" w:eastAsia="Century Gothic"/>
+          <w:b/>
+        </w:rPr>
+        <w:t>))</w:t>
       </w:r>
     </w:p>
     <w:p>
       <w:pPr>
-        <w:spacing w:after="0"/>
+        <w:spacing w:after="0" w:before="0" w:line="240" w:lineRule="auto"/>
         <w:rPr>
           <w:rFonts w:ascii="Century Gothic" w:hAnsi="Century Gothic"/>
           <w:b/>
@@ -69,21 +96,22 @@
     </w:p>
     <w:p>
       <w:pPr>
-        <w:spacing w:after="0"/>
+        <w:spacing w:after="0" w:before="0" w:line="240" w:lineRule="auto"/>
         <w:rPr>
           <w:rFonts w:ascii="Century Gothic" w:hAnsi="Century Gothic"/>
         </w:rPr>
       </w:pPr>
       <w:r>
         <w:rPr>
-          <w:rFonts w:ascii="Century Gothic" w:hAnsi="Century Gothic"/>
+          <w:rFonts w:ascii="Century Gothic" w:hAnsi="Century Gothic" w:cs="Century Gothic" w:eastAsia="Century Gothic"/>
+          <w:b w:val="0"/>
         </w:rPr>
         <w:t>Señor.</w:t>
       </w:r>
     </w:p>
     <w:p>
       <w:pPr>
-        <w:spacing w:after="0"/>
+        <w:spacing w:after="0" w:before="0" w:line="240" w:lineRule="auto"/>
         <w:jc w:val="both"/>
         <w:rPr>
           <w:rFonts w:ascii="Century Gothic" w:hAnsi="Century Gothic"/>
@@ -93,7 +121,7 @@
       </w:pPr>
       <w:r>
         <w:rPr>
-          <w:rFonts w:ascii="Century Gothic" w:hAnsi="Century Gothic"/>
+          <w:rFonts w:ascii="Century Gothic" w:hAnsi="Century Gothic" w:cs="Century Gothic" w:eastAsia="Century Gothic"/>
           <w:b/>
         </w:rPr>
         <w:t>JUEZ CIVIL MUNICIPAL DE {{ ciudad_mayus }} (REPARTO).</w:t>
@@ -101,7 +129,7 @@
     </w:p>
     <w:p>
       <w:pPr>
-        <w:spacing w:after="0"/>
+        <w:spacing w:after="0" w:before="0" w:line="240" w:lineRule="auto"/>
         <w:jc w:val="both"/>
         <w:rPr>
           <w:rFonts w:ascii="Century Gothic" w:hAnsi="Century Gothic"/>
@@ -111,16 +139,15 @@
       </w:pPr>
       <w:r>
         <w:rPr>
-          <w:rFonts w:ascii="Century Gothic" w:hAnsi="Century Gothic"/>
+          <w:rFonts w:ascii="Century Gothic" w:hAnsi="Century Gothic" w:cs="Century Gothic" w:eastAsia="Century Gothic"/>
           <w:b/>
-          <w:bCs/>
         </w:rPr>
         <w:t>E.S.D</w:t>
       </w:r>
     </w:p>
     <w:p>
       <w:pPr>
-        <w:spacing w:after="0"/>
+        <w:spacing w:after="0" w:before="0" w:line="240" w:lineRule="auto"/>
         <w:jc w:val="both"/>
         <w:rPr>
           <w:rFonts w:ascii="Century Gothic" w:hAnsi="Century Gothic"/>
@@ -131,7 +158,7 @@
     </w:p>
     <w:p>
       <w:pPr>
-        <w:spacing w:after="0"/>
+        <w:spacing w:after="0" w:before="0" w:line="240" w:lineRule="auto"/>
         <w:jc w:val="both"/>
         <w:rPr>
           <w:rFonts w:ascii="Century Gothic" w:hAnsi="Century Gothic"/>
@@ -141,14 +168,71 @@
       <w:proofErr w:type="spellEnd"/>
       <w:r>
         <w:rPr>
-          <w:rFonts w:ascii="Century Gothic" w:hAnsi="Century Gothic" w:cs="Century Gothic"/>
-        </w:rPr>
-        <w:t>La suscrita representante legal de la {{ copropiedad_nombre }} PROPIEDAD HORIZONTAL, legalmente constituida e inscrita con N.I.T.: {{ copropiedad_nit }} y domicilio principal en la ciudad de {{ ciudad }}, se permite indicar que el inmueble {{ torre_apto }} de la {{ conjunto_nombre }} PROPIEDAD HORIZONTAL, de propiedad del señor {{ titular_nombre }} mayor de edad y vecino de la ciudad de {{ ciudad }}, identificado con el numero de cedula {{ titular_cedula }}, adeuda los siguientes valores:</w:t>
+          <w:rFonts w:ascii="Century Gothic" w:hAnsi="Century Gothic" w:cs="Century Gothic" w:eastAsia="Century Gothic"/>
+          <w:b w:val="0"/>
+        </w:rPr>
+        <w:t xml:space="preserve">La suscrita representante legal de la </w:t>
+      </w:r>
+      <w:r>
+        <w:rPr>
+          <w:rFonts w:ascii="Century Gothic" w:hAnsi="Century Gothic" w:cs="Century Gothic" w:eastAsia="Century Gothic"/>
+          <w:b/>
+        </w:rPr>
+        <w:t>{{ copropiedad_nombre }} PROPIEDAD HORIZONTAL,</w:t>
+      </w:r>
+      <w:r>
+        <w:rPr>
+          <w:rFonts w:ascii="Century Gothic" w:hAnsi="Century Gothic" w:cs="Century Gothic" w:eastAsia="Century Gothic"/>
+          <w:b w:val="0"/>
+        </w:rPr>
+        <w:t xml:space="preserve"> legalmente constituida e inscrita con N.I.T.: {{ copropiedad_nit }} y domicilio principal en la ciudad de {{ ciudad }}, se permite indicar que el inmueble {{ torre_apto }} de la </w:t>
+      </w:r>
+      <w:r>
+        <w:rPr>
+          <w:rFonts w:ascii="Century Gothic" w:hAnsi="Century Gothic" w:cs="Century Gothic" w:eastAsia="Century Gothic"/>
+          <w:b/>
+        </w:rPr>
+        <w:t>PROPIEDAD HORIZONTAL (({{ conjunto_nombre }})),</w:t>
+      </w:r>
+      <w:r>
+        <w:rPr>
+          <w:rFonts w:ascii="Century Gothic" w:hAnsi="Century Gothic" w:cs="Century Gothic" w:eastAsia="Century Gothic"/>
+          <w:b w:val="0"/>
+        </w:rPr>
+        <w:t xml:space="preserve"> de propiedad del (la) señor(a) </w:t>
+      </w:r>
+      <w:r>
+        <w:rPr>
+          <w:rFonts w:ascii="Century Gothic" w:hAnsi="Century Gothic" w:cs="Century Gothic" w:eastAsia="Century Gothic"/>
+          <w:b/>
+        </w:rPr>
+        <w:t>{{ titular_nombre }}</w:t>
+      </w:r>
+      <w:r>
+        <w:rPr>
+          <w:rFonts w:ascii="Century Gothic" w:hAnsi="Century Gothic" w:cs="Century Gothic" w:eastAsia="Century Gothic"/>
+          <w:b w:val="0"/>
+        </w:rPr>
+        <w:t xml:space="preserve"> mayor de edad y vecino(a) de la ciudad de {{ ciudad }}, identificado con el numero de cedula </w:t>
+      </w:r>
+      <w:r>
+        <w:rPr>
+          <w:rFonts w:ascii="Century Gothic" w:hAnsi="Century Gothic" w:cs="Century Gothic" w:eastAsia="Century Gothic"/>
+          <w:b/>
+        </w:rPr>
+        <w:t>(({{ titular_cedula }}))</w:t>
+      </w:r>
+      <w:r>
+        <w:rPr>
+          <w:rFonts w:ascii="Century Gothic" w:hAnsi="Century Gothic" w:cs="Century Gothic" w:eastAsia="Century Gothic"/>
+          <w:b w:val="0"/>
+        </w:rPr>
+        <w:t>, adeuda los siguientes valores:</w:t>
       </w:r>
     </w:p>
     <w:p>
       <w:pPr>
-        <w:spacing w:after="0"/>
+        <w:spacing w:after="0" w:before="0" w:line="240" w:lineRule="auto"/>
         <w:jc w:val="both"/>
         <w:rPr>
           <w:rFonts w:ascii="Century Gothic" w:hAnsi="Century Gothic"/>
@@ -192,7 +276,7 @@
           </w:tcPr>
           <w:p>
             <w:pPr>
-              <w:spacing w:after="0" w:line="240" w:lineRule="auto"/>
+              <w:spacing w:after="0" w:line="240" w:lineRule="auto" w:before="0"/>
               <w:jc w:val="center"/>
               <w:rPr>
                 <w:rFonts w:ascii="Calibri" w:eastAsia="Times New Roman" w:hAnsi="Calibri" w:cs="Calibri"/>
@@ -229,7 +313,7 @@
           </w:tcPr>
           <w:p>
             <w:pPr>
-              <w:spacing w:after="0" w:line="240" w:lineRule="auto"/>
+              <w:spacing w:after="0" w:line="240" w:lineRule="auto" w:before="0"/>
               <w:jc w:val="center"/>
               <w:rPr>
                 <w:rFonts w:ascii="Calibri" w:eastAsia="Times New Roman" w:hAnsi="Calibri" w:cs="Calibri"/>
@@ -265,7 +349,7 @@
           </w:tcPr>
           <w:p>
             <w:pPr>
-              <w:spacing w:after="0" w:line="240" w:lineRule="auto"/>
+              <w:spacing w:after="0" w:line="240" w:lineRule="auto" w:before="0"/>
               <w:jc w:val="center"/>
               <w:rPr>
                 <w:rFonts w:ascii="Calibri" w:eastAsia="Times New Roman" w:hAnsi="Calibri" w:cs="Calibri"/>
@@ -301,7 +385,7 @@
           </w:tcPr>
           <w:p>
             <w:pPr>
-              <w:spacing w:after="0" w:line="240" w:lineRule="auto"/>
+              <w:spacing w:after="0" w:line="240" w:lineRule="auto" w:before="0"/>
               <w:jc w:val="center"/>
               <w:rPr>
                 <w:rFonts w:ascii="Calibri" w:eastAsia="Times New Roman" w:hAnsi="Calibri" w:cs="Calibri"/>
@@ -338,7 +422,7 @@
           </w:tcPr>
           <w:p>
             <w:pPr>
-              <w:spacing w:after="0" w:line="240" w:lineRule="auto"/>
+              <w:spacing w:after="0" w:line="240" w:lineRule="auto" w:before="0"/>
               <w:jc w:val="center"/>
               <w:rPr>
                 <w:rFonts w:ascii="Calibri" w:eastAsia="Times New Roman" w:hAnsi="Calibri" w:cs="Calibri"/>
@@ -375,7 +459,7 @@
           </w:tcPr>
           <w:p>
             <w:pPr>
-              <w:spacing w:after="0" w:line="240" w:lineRule="auto"/>
+              <w:spacing w:after="0" w:line="240" w:lineRule="auto" w:before="0"/>
               <w:jc w:val="center"/>
               <w:rPr>
                 <w:rFonts w:ascii="Calibri" w:eastAsia="Times New Roman" w:hAnsi="Calibri" w:cs="Calibri"/>
@@ -417,7 +501,7 @@
           </w:tcPr>
           <w:p>
             <w:pPr>
-              <w:spacing w:after="0" w:line="240" w:lineRule="auto"/>
+              <w:spacing w:after="0" w:line="240" w:lineRule="auto" w:before="0"/>
               <w:rPr>
                 <w:rFonts w:ascii="Calibri" w:eastAsia="Times New Roman" w:hAnsi="Calibri" w:cs="Calibri"/>
                 <w:color w:val="000000"/>
@@ -449,7 +533,7 @@
           </w:tcPr>
           <w:p>
             <w:pPr>
-              <w:spacing w:after="0" w:line="240" w:lineRule="auto"/>
+              <w:spacing w:after="0" w:line="240" w:lineRule="auto" w:before="0"/>
               <w:jc w:val="right"/>
               <w:rPr>
                 <w:rFonts w:ascii="Calibri" w:eastAsia="Times New Roman" w:hAnsi="Calibri" w:cs="Calibri"/>
@@ -481,7 +565,7 @@
           </w:tcPr>
           <w:p>
             <w:pPr>
-              <w:spacing w:after="0" w:line="240" w:lineRule="auto"/>
+              <w:spacing w:after="0" w:line="240" w:lineRule="auto" w:before="0"/>
               <w:jc w:val="right"/>
               <w:rPr>
                 <w:rFonts w:ascii="Calibri" w:eastAsia="Times New Roman" w:hAnsi="Calibri" w:cs="Calibri"/>
@@ -513,7 +597,7 @@
           </w:tcPr>
           <w:p>
             <w:pPr>
-              <w:spacing w:after="0" w:line="240" w:lineRule="auto"/>
+              <w:spacing w:after="0" w:line="240" w:lineRule="auto" w:before="0"/>
               <w:rPr>
                 <w:rFonts w:ascii="Calibri" w:eastAsia="Times New Roman" w:hAnsi="Calibri" w:cs="Calibri"/>
                 <w:color w:val="000000"/>
@@ -544,7 +628,7 @@
           </w:tcPr>
           <w:p>
             <w:pPr>
-              <w:spacing w:after="0" w:line="240" w:lineRule="auto"/>
+              <w:spacing w:after="0" w:line="240" w:lineRule="auto" w:before="0"/>
               <w:jc w:val="right"/>
               <w:rPr>
                 <w:rFonts w:ascii="Calibri" w:eastAsia="Times New Roman" w:hAnsi="Calibri" w:cs="Calibri"/>
@@ -576,7 +660,7 @@
           </w:tcPr>
           <w:p>
             <w:pPr>
-              <w:spacing w:after="0" w:line="240" w:lineRule="auto"/>
+              <w:spacing w:after="0" w:line="240" w:lineRule="auto" w:before="0"/>
               <w:jc w:val="right"/>
               <w:rPr>
                 <w:rFonts w:ascii="Calibri" w:eastAsia="Times New Roman" w:hAnsi="Calibri" w:cs="Calibri"/>
@@ -613,7 +697,7 @@
           </w:tcPr>
           <w:p>
             <w:pPr>
-              <w:spacing w:after="0" w:line="240" w:lineRule="auto"/>
+              <w:spacing w:after="0" w:line="240" w:lineRule="auto" w:before="0"/>
               <w:rPr>
                 <w:rFonts w:ascii="Calibri" w:eastAsia="Times New Roman" w:hAnsi="Calibri" w:cs="Calibri"/>
                 <w:color w:val="000000"/>
@@ -645,7 +729,7 @@
           </w:tcPr>
           <w:p>
             <w:pPr>
-              <w:spacing w:after="0" w:line="240" w:lineRule="auto"/>
+              <w:spacing w:after="0" w:line="240" w:lineRule="auto" w:before="0"/>
               <w:jc w:val="right"/>
               <w:rPr>
                 <w:rFonts w:ascii="Calibri" w:eastAsia="Times New Roman" w:hAnsi="Calibri" w:cs="Calibri"/>
@@ -678,7 +762,7 @@
           </w:tcPr>
           <w:p>
             <w:pPr>
-              <w:spacing w:after="0" w:line="240" w:lineRule="auto"/>
+              <w:spacing w:after="0" w:line="240" w:lineRule="auto" w:before="0"/>
               <w:jc w:val="right"/>
               <w:rPr>
                 <w:rFonts w:ascii="Calibri" w:eastAsia="Times New Roman" w:hAnsi="Calibri" w:cs="Calibri"/>
@@ -711,7 +795,7 @@
           </w:tcPr>
           <w:p>
             <w:pPr>
-              <w:spacing w:after="0" w:line="240" w:lineRule="auto"/>
+              <w:spacing w:after="0" w:line="240" w:lineRule="auto" w:before="0"/>
               <w:rPr>
                 <w:rFonts w:ascii="Calibri" w:eastAsia="Times New Roman" w:hAnsi="Calibri" w:cs="Calibri"/>
                 <w:color w:val="000000"/>
@@ -743,7 +827,7 @@
           </w:tcPr>
           <w:p>
             <w:pPr>
-              <w:spacing w:after="0" w:line="240" w:lineRule="auto"/>
+              <w:spacing w:after="0" w:line="240" w:lineRule="auto" w:before="0"/>
               <w:jc w:val="right"/>
               <w:rPr>
                 <w:rFonts w:ascii="Calibri" w:eastAsia="Times New Roman" w:hAnsi="Calibri" w:cs="Calibri"/>
@@ -776,7 +860,7 @@
           </w:tcPr>
           <w:p>
             <w:pPr>
-              <w:spacing w:after="0" w:line="240" w:lineRule="auto"/>
+              <w:spacing w:after="0" w:line="240" w:lineRule="auto" w:before="0"/>
               <w:jc w:val="right"/>
               <w:rPr>
                 <w:rFonts w:ascii="Calibri" w:eastAsia="Times New Roman" w:hAnsi="Calibri" w:cs="Calibri"/>
@@ -814,7 +898,7 @@
           </w:tcPr>
           <w:p>
             <w:pPr>
-              <w:spacing w:after="0" w:line="240" w:lineRule="auto"/>
+              <w:spacing w:after="0" w:line="240" w:lineRule="auto" w:before="0"/>
               <w:rPr>
                 <w:rFonts w:ascii="Calibri" w:eastAsia="Times New Roman" w:hAnsi="Calibri" w:cs="Calibri"/>
                 <w:color w:val="000000"/>
@@ -846,7 +930,7 @@
           </w:tcPr>
           <w:p>
             <w:pPr>
-              <w:spacing w:after="0" w:line="240" w:lineRule="auto"/>
+              <w:spacing w:after="0" w:line="240" w:lineRule="auto" w:before="0"/>
               <w:jc w:val="right"/>
               <w:rPr>
                 <w:rFonts w:ascii="Calibri" w:eastAsia="Times New Roman" w:hAnsi="Calibri" w:cs="Calibri"/>
@@ -878,7 +962,7 @@
           </w:tcPr>
           <w:p>
             <w:pPr>
-              <w:spacing w:after="0" w:line="240" w:lineRule="auto"/>
+              <w:spacing w:after="0" w:line="240" w:lineRule="auto" w:before="0"/>
               <w:jc w:val="right"/>
               <w:rPr>
                 <w:rFonts w:ascii="Calibri" w:eastAsia="Times New Roman" w:hAnsi="Calibri" w:cs="Calibri"/>
@@ -910,7 +994,7 @@
           </w:tcPr>
           <w:p>
             <w:pPr>
-              <w:spacing w:after="0" w:line="240" w:lineRule="auto"/>
+              <w:spacing w:after="0" w:line="240" w:lineRule="auto" w:before="0"/>
               <w:rPr>
                 <w:rFonts w:ascii="Calibri" w:eastAsia="Times New Roman" w:hAnsi="Calibri" w:cs="Calibri"/>
                 <w:color w:val="000000"/>
@@ -941,7 +1025,7 @@
           </w:tcPr>
           <w:p>
             <w:pPr>
-              <w:spacing w:after="0" w:line="240" w:lineRule="auto"/>
+              <w:spacing w:after="0" w:line="240" w:lineRule="auto" w:before="0"/>
               <w:jc w:val="right"/>
               <w:rPr>
                 <w:rFonts w:ascii="Calibri" w:eastAsia="Times New Roman" w:hAnsi="Calibri" w:cs="Calibri"/>
@@ -973,7 +1057,7 @@
           </w:tcPr>
           <w:p>
             <w:pPr>
-              <w:spacing w:after="0" w:line="240" w:lineRule="auto"/>
+              <w:spacing w:after="0" w:line="240" w:lineRule="auto" w:before="0"/>
               <w:jc w:val="right"/>
               <w:rPr>
                 <w:rFonts w:ascii="Calibri" w:eastAsia="Times New Roman" w:hAnsi="Calibri" w:cs="Calibri"/>
@@ -1011,7 +1095,7 @@
           </w:tcPr>
           <w:p>
             <w:pPr>
-              <w:spacing w:after="0" w:line="240" w:lineRule="auto"/>
+              <w:spacing w:after="0" w:line="240" w:lineRule="auto" w:before="0"/>
               <w:jc w:val="center"/>
               <w:rPr>
                 <w:rFonts w:ascii="Calibri" w:eastAsia="Times New Roman" w:hAnsi="Calibri" w:cs="Calibri"/>
@@ -1048,7 +1132,7 @@
           </w:tcPr>
           <w:p>
             <w:pPr>
-              <w:spacing w:after="0" w:line="240" w:lineRule="auto"/>
+              <w:spacing w:after="0" w:line="240" w:lineRule="auto" w:before="0"/>
               <w:jc w:val="right"/>
               <w:rPr>
                 <w:rFonts w:ascii="Calibri" w:eastAsia="Times New Roman" w:hAnsi="Calibri" w:cs="Calibri"/>
@@ -1070,7 +1154,7 @@
     </w:tbl>
     <w:p>
       <w:pPr>
-        <w:spacing w:after="0"/>
+        <w:spacing w:after="0" w:before="0" w:line="240" w:lineRule="auto"/>
         <w:jc w:val="both"/>
         <w:rPr>
           <w:rFonts w:ascii="Century Gothic" w:hAnsi="Century Gothic"/>
@@ -1079,7 +1163,7 @@
     </w:p>
     <w:p>
       <w:pPr>
-        <w:spacing w:after="0"/>
+        <w:spacing w:after="0" w:before="0" w:line="240" w:lineRule="auto"/>
         <w:jc w:val="both"/>
         <w:rPr>
           <w:rFonts w:ascii="Century Gothic" w:hAnsi="Century Gothic"/>
@@ -1087,14 +1171,15 @@
       </w:pPr>
       <w:r>
         <w:rPr>
-          <w:rFonts w:ascii="Century Gothic" w:hAnsi="Century Gothic" w:cs="Century Gothic"/>
+          <w:rFonts w:ascii="Century Gothic" w:hAnsi="Century Gothic" w:cs="Century Gothic" w:eastAsia="Century Gothic"/>
+          <w:b w:val="0"/>
         </w:rPr>
         <w:t>Este certificado de deuda se expide a los {{ dia_emision }} días del mes de {{ mes_emision }} de {{ anio_emision }}.</w:t>
       </w:r>
     </w:p>
     <w:p>
       <w:pPr>
-        <w:spacing w:after="0"/>
+        <w:spacing w:after="0" w:before="0" w:line="240" w:lineRule="auto"/>
         <w:jc w:val="both"/>
         <w:rPr>
           <w:rFonts w:ascii="Century Gothic" w:hAnsi="Century Gothic"/>
@@ -1103,7 +1188,7 @@
     </w:p>
     <w:p>
       <w:pPr>
-        <w:spacing w:after="0"/>
+        <w:spacing w:after="0" w:before="0" w:line="240" w:lineRule="auto"/>
         <w:jc w:val="both"/>
         <w:rPr>
           <w:rFonts w:ascii="Century Gothic" w:hAnsi="Century Gothic"/>
@@ -1111,14 +1196,15 @@
       </w:pPr>
       <w:r>
         <w:rPr>
-          <w:rFonts w:ascii="Century Gothic" w:hAnsi="Century Gothic"/>
+          <w:rFonts w:ascii="Century Gothic" w:hAnsi="Century Gothic" w:cs="Century Gothic" w:eastAsia="Century Gothic"/>
+          <w:b w:val="0"/>
         </w:rPr>
         <w:t>Atentamente,</w:t>
       </w:r>
     </w:p>
     <w:p>
       <w:pPr>
-        <w:spacing w:after="0"/>
+        <w:spacing w:after="0" w:before="0" w:line="240" w:lineRule="auto"/>
         <w:jc w:val="both"/>
         <w:rPr>
           <w:rFonts w:ascii="Century Gothic" w:hAnsi="Century Gothic"/>
@@ -1127,7 +1213,7 @@
     </w:p>
     <w:p>
       <w:pPr>
-        <w:spacing w:after="0"/>
+        <w:spacing w:after="0" w:before="0" w:line="240" w:lineRule="auto"/>
         <w:jc w:val="both"/>
         <w:rPr>
           <w:rFonts w:ascii="Century Gothic" w:hAnsi="Century Gothic"/>
@@ -1136,7 +1222,7 @@
     </w:p>
     <w:p>
       <w:pPr>
-        <w:spacing w:after="0"/>
+        <w:spacing w:after="0" w:before="0" w:line="240" w:lineRule="auto"/>
         <w:jc w:val="both"/>
         <w:rPr>
           <w:rFonts w:ascii="Century Gothic" w:hAnsi="Century Gothic"/>
@@ -1145,7 +1231,7 @@
     </w:p>
     <w:p>
       <w:pPr>
-        <w:spacing w:after="0"/>
+        <w:spacing w:after="0" w:before="0" w:line="240" w:lineRule="auto"/>
         <w:jc w:val="both"/>
         <w:rPr>
           <w:rFonts w:ascii="Century Gothic" w:hAnsi="Century Gothic"/>
@@ -1154,7 +1240,7 @@
     </w:p>
     <w:p>
       <w:pPr>
-        <w:spacing w:after="0"/>
+        <w:spacing w:after="0" w:before="0" w:line="240" w:lineRule="auto"/>
         <w:jc w:val="both"/>
         <w:rPr>
           <w:rFonts w:ascii="Century Gothic" w:hAnsi="Century Gothic" w:cs="Arial"/>
@@ -1164,7 +1250,7 @@
       </w:pPr>
       <w:r>
         <w:rPr>
-          <w:rFonts w:ascii="Century Gothic" w:hAnsi="Century Gothic" w:cs="Century Gothic"/>
+          <w:rFonts w:ascii="Century Gothic" w:hAnsi="Century Gothic" w:cs="Century Gothic" w:eastAsia="Century Gothic"/>
           <w:b/>
         </w:rPr>
         <w:t>{{ representante_nombre }}</w:t>
@@ -1172,7 +1258,7 @@
     </w:p>
     <w:p>
       <w:pPr>
-        <w:spacing w:after="0"/>
+        <w:spacing w:after="0" w:before="0" w:line="240" w:lineRule="auto"/>
         <w:jc w:val="both"/>
         <w:rPr>
           <w:rFonts w:ascii="Century Gothic" w:hAnsi="Century Gothic" w:cs="Arial"/>
@@ -1180,14 +1266,15 @@
       </w:pPr>
       <w:r>
         <w:rPr>
-          <w:rFonts w:ascii="Century Gothic" w:hAnsi="Century Gothic" w:cs="Century Gothic"/>
+          <w:rFonts w:ascii="Century Gothic" w:hAnsi="Century Gothic" w:cs="Century Gothic" w:eastAsia="Century Gothic"/>
+          <w:b w:val="0"/>
         </w:rPr>
         <w:t>C.C. No. {{ representante_cedula }}</w:t>
       </w:r>
     </w:p>
     <w:p>
       <w:pPr>
-        <w:spacing w:after="0"/>
+        <w:spacing w:after="0" w:before="0" w:line="240" w:lineRule="auto"/>
         <w:jc w:val="both"/>
         <w:rPr>
           <w:rFonts w:ascii="Century Gothic" w:hAnsi="Century Gothic" w:cs="Arial"/>
@@ -1195,14 +1282,15 @@
       </w:pPr>
       <w:r>
         <w:rPr>
-          <w:rFonts w:ascii="Century Gothic" w:hAnsi="Century Gothic" w:cs="Century Gothic"/>
+          <w:rFonts w:ascii="Century Gothic" w:hAnsi="Century Gothic" w:cs="Century Gothic" w:eastAsia="Century Gothic"/>
+          <w:b w:val="0"/>
         </w:rPr>
         <w:t>R.L {{ copropiedad_nombre }} PH</w:t>
       </w:r>
     </w:p>
     <w:p>
       <w:pPr>
-        <w:spacing w:after="0"/>
+        <w:spacing w:after="0" w:before="0" w:line="240" w:lineRule="auto"/>
         <w:jc w:val="both"/>
         <w:rPr>
           <w:rFonts w:ascii="Century Gothic" w:hAnsi="Century Gothic"/>
@@ -1210,7 +1298,7 @@
       </w:pPr>
     </w:p>
     <w:sectPr>
-      <w:pgSz w:w="12240" w:h="15840"/>
+      <w:pgSz w:w="12240" w:h="18720"/>
       <w:pgMar w:top="1417" w:right="1701" w:bottom="1417" w:left="1701" w:header="708" w:footer="708" w:gutter="0"/>
       <w:cols w:space="708"/>
       <w:docGrid w:linePitch="360"/>

</xml_diff>

<commit_message>
fix: quitar paréntesis de campos en plantillas certificado/poder
Revierten solo los ((…)) alrededor de PH/NIT/conjunto/cédula/ejecutante
introducidos en #40. Se mantienen oficio 8.5×13, interlineado single y
negritas selectivas.

Co-authored-by: ParedesD28 <ParedesD28@users.noreply.github.com>
</commit_message>
<xml_diff>
--- a/static/plantillas/CERTIFICADO_DE_DEUDA.docx
+++ b/static/plantillas/CERTIFICADO_DE_DEUDA.docx
@@ -35,21 +35,7 @@
           <w:rFonts w:ascii="Century Gothic" w:hAnsi="Century Gothic" w:cs="Century Gothic" w:eastAsia="Century Gothic"/>
           <w:b/>
         </w:rPr>
-        <w:t>((</w:t>
-      </w:r>
-      <w:r>
-        <w:rPr>
-          <w:rFonts w:ascii="Century Gothic" w:hAnsi="Century Gothic" w:cs="Century Gothic" w:eastAsia="Century Gothic"/>
-          <w:b/>
-        </w:rPr>
         <w:t>{{ copropiedad_nombre }} PROPIEDAD HORIZONTAL</w:t>
-      </w:r>
-      <w:r>
-        <w:rPr>
-          <w:rFonts w:ascii="Century Gothic" w:hAnsi="Century Gothic" w:cs="Century Gothic" w:eastAsia="Century Gothic"/>
-          <w:b/>
-        </w:rPr>
-        <w:t>))</w:t>
       </w:r>
     </w:p>
     <w:p>
@@ -67,21 +53,7 @@
           <w:rFonts w:ascii="Century Gothic" w:hAnsi="Century Gothic" w:cs="Century Gothic" w:eastAsia="Century Gothic"/>
           <w:b/>
         </w:rPr>
-        <w:t>N.I.T.: ((</w:t>
-      </w:r>
-      <w:r>
-        <w:rPr>
-          <w:rFonts w:ascii="Century Gothic" w:hAnsi="Century Gothic" w:cs="Century Gothic" w:eastAsia="Century Gothic"/>
-          <w:b/>
-        </w:rPr>
-        <w:t>{{ copropiedad_nit }}</w:t>
-      </w:r>
-      <w:r>
-        <w:rPr>
-          <w:rFonts w:ascii="Century Gothic" w:hAnsi="Century Gothic" w:cs="Century Gothic" w:eastAsia="Century Gothic"/>
-          <w:b/>
-        </w:rPr>
-        <w:t>))</w:t>
+        <w:t>N.I.T.: {{ copropiedad_nit }}</w:t>
       </w:r>
     </w:p>
     <w:p>
@@ -192,7 +164,7 @@
           <w:rFonts w:ascii="Century Gothic" w:hAnsi="Century Gothic" w:cs="Century Gothic" w:eastAsia="Century Gothic"/>
           <w:b/>
         </w:rPr>
-        <w:t>PROPIEDAD HORIZONTAL (({{ conjunto_nombre }})),</w:t>
+        <w:t>PROPIEDAD HORIZONTAL {{ conjunto_nombre }},</w:t>
       </w:r>
       <w:r>
         <w:rPr>
@@ -220,7 +192,7 @@
           <w:rFonts w:ascii="Century Gothic" w:hAnsi="Century Gothic" w:cs="Century Gothic" w:eastAsia="Century Gothic"/>
           <w:b/>
         </w:rPr>
-        <w:t>(({{ titular_cedula }}))</w:t>
+        <w:t>{{ titular_cedula }}</w:t>
       </w:r>
       <w:r>
         <w:rPr>

</xml_diff>

<commit_message>
fix: aire entre bloques y firmas keep-with en certificado/poder
Single spacing se mantiene; enters en cuerpo del poder; keepNext/
keepLines/widowControl en antefirmas; page break solo cert↔poder.

Co-authored-by: ParedesD28 <ParedesD28@users.noreply.github.com>
</commit_message>
<xml_diff>
--- a/static/plantillas/CERTIFICADO_DE_DEUDA.docx
+++ b/static/plantillas/CERTIFICADO_DE_DEUDA.docx
@@ -6,6 +6,7 @@
       <w:pPr>
         <w:spacing w:after="0" w:before="0" w:line="240" w:lineRule="auto"/>
         <w:jc w:val="center"/>
+        <w:widowControl w:val="1"/>
         <w:rPr>
           <w:rFonts w:ascii="Century Gothic" w:hAnsi="Century Gothic"/>
           <w:b/>
@@ -24,6 +25,7 @@
       <w:pPr>
         <w:spacing w:after="0" w:before="0" w:line="240" w:lineRule="auto"/>
         <w:jc w:val="center"/>
+        <w:widowControl w:val="1"/>
         <w:rPr>
           <w:rFonts w:ascii="Century Gothic" w:hAnsi="Century Gothic"/>
           <w:b/>
@@ -42,6 +44,7 @@
       <w:pPr>
         <w:spacing w:after="0" w:before="0" w:line="240" w:lineRule="auto"/>
         <w:jc w:val="center"/>
+        <w:widowControl w:val="1"/>
         <w:rPr>
           <w:rFonts w:ascii="Century Gothic" w:hAnsi="Century Gothic"/>
           <w:b/>
@@ -59,6 +62,7 @@
     <w:p>
       <w:pPr>
         <w:spacing w:after="0" w:before="0" w:line="240" w:lineRule="auto"/>
+        <w:widowControl w:val="1"/>
         <w:rPr>
           <w:rFonts w:ascii="Century Gothic" w:hAnsi="Century Gothic"/>
           <w:b/>
@@ -69,6 +73,7 @@
     <w:p>
       <w:pPr>
         <w:spacing w:after="0" w:before="0" w:line="240" w:lineRule="auto"/>
+        <w:widowControl w:val="1"/>
         <w:rPr>
           <w:rFonts w:ascii="Century Gothic" w:hAnsi="Century Gothic"/>
         </w:rPr>
@@ -85,6 +90,7 @@
       <w:pPr>
         <w:spacing w:after="0" w:before="0" w:line="240" w:lineRule="auto"/>
         <w:jc w:val="both"/>
+        <w:widowControl w:val="1"/>
         <w:rPr>
           <w:rFonts w:ascii="Century Gothic" w:hAnsi="Century Gothic"/>
           <w:b/>
@@ -103,6 +109,7 @@
       <w:pPr>
         <w:spacing w:after="0" w:before="0" w:line="240" w:lineRule="auto"/>
         <w:jc w:val="both"/>
+        <w:widowControl w:val="1"/>
         <w:rPr>
           <w:rFonts w:ascii="Century Gothic" w:hAnsi="Century Gothic"/>
           <w:b/>
@@ -121,6 +128,7 @@
       <w:pPr>
         <w:spacing w:after="0" w:before="0" w:line="240" w:lineRule="auto"/>
         <w:jc w:val="both"/>
+        <w:widowControl w:val="1"/>
         <w:rPr>
           <w:rFonts w:ascii="Century Gothic" w:hAnsi="Century Gothic"/>
           <w:b/>
@@ -132,6 +140,7 @@
       <w:pPr>
         <w:spacing w:after="0" w:before="0" w:line="240" w:lineRule="auto"/>
         <w:jc w:val="both"/>
+        <w:widowControl w:val="1"/>
         <w:rPr>
           <w:rFonts w:ascii="Century Gothic" w:hAnsi="Century Gothic"/>
         </w:rPr>
@@ -206,6 +215,7 @@
       <w:pPr>
         <w:spacing w:after="0" w:before="0" w:line="240" w:lineRule="auto"/>
         <w:jc w:val="both"/>
+        <w:widowControl w:val="1"/>
         <w:rPr>
           <w:rFonts w:ascii="Century Gothic" w:hAnsi="Century Gothic"/>
         </w:rPr>
@@ -1128,6 +1138,7 @@
       <w:pPr>
         <w:spacing w:after="0" w:before="0" w:line="240" w:lineRule="auto"/>
         <w:jc w:val="both"/>
+        <w:widowControl w:val="1"/>
         <w:rPr>
           <w:rFonts w:ascii="Century Gothic" w:hAnsi="Century Gothic"/>
         </w:rPr>
@@ -1137,6 +1148,7 @@
       <w:pPr>
         <w:spacing w:after="0" w:before="0" w:line="240" w:lineRule="auto"/>
         <w:jc w:val="both"/>
+        <w:widowControl w:val="1"/>
         <w:rPr>
           <w:rFonts w:ascii="Century Gothic" w:hAnsi="Century Gothic"/>
         </w:rPr>
@@ -1153,6 +1165,7 @@
       <w:pPr>
         <w:spacing w:after="0" w:before="0" w:line="240" w:lineRule="auto"/>
         <w:jc w:val="both"/>
+        <w:widowControl w:val="1"/>
         <w:rPr>
           <w:rFonts w:ascii="Century Gothic" w:hAnsi="Century Gothic"/>
         </w:rPr>
@@ -1162,6 +1175,9 @@
       <w:pPr>
         <w:spacing w:after="0" w:before="0" w:line="240" w:lineRule="auto"/>
         <w:jc w:val="both"/>
+        <w:widowControl w:val="1"/>
+        <w:keepNext/>
+        <w:keepLines/>
         <w:rPr>
           <w:rFonts w:ascii="Century Gothic" w:hAnsi="Century Gothic"/>
         </w:rPr>
@@ -1178,6 +1194,9 @@
       <w:pPr>
         <w:spacing w:after="0" w:before="0" w:line="240" w:lineRule="auto"/>
         <w:jc w:val="both"/>
+        <w:widowControl w:val="1"/>
+        <w:keepNext/>
+        <w:keepLines/>
         <w:rPr>
           <w:rFonts w:ascii="Century Gothic" w:hAnsi="Century Gothic"/>
         </w:rPr>
@@ -1187,6 +1206,9 @@
       <w:pPr>
         <w:spacing w:after="0" w:before="0" w:line="240" w:lineRule="auto"/>
         <w:jc w:val="both"/>
+        <w:widowControl w:val="1"/>
+        <w:keepNext/>
+        <w:keepLines/>
         <w:rPr>
           <w:rFonts w:ascii="Century Gothic" w:hAnsi="Century Gothic"/>
         </w:rPr>
@@ -1196,6 +1218,9 @@
       <w:pPr>
         <w:spacing w:after="0" w:before="0" w:line="240" w:lineRule="auto"/>
         <w:jc w:val="both"/>
+        <w:widowControl w:val="1"/>
+        <w:keepNext/>
+        <w:keepLines/>
         <w:rPr>
           <w:rFonts w:ascii="Century Gothic" w:hAnsi="Century Gothic"/>
         </w:rPr>
@@ -1205,6 +1230,9 @@
       <w:pPr>
         <w:spacing w:after="0" w:before="0" w:line="240" w:lineRule="auto"/>
         <w:jc w:val="both"/>
+        <w:widowControl w:val="1"/>
+        <w:keepNext/>
+        <w:keepLines/>
         <w:rPr>
           <w:rFonts w:ascii="Century Gothic" w:hAnsi="Century Gothic"/>
         </w:rPr>
@@ -1214,6 +1242,9 @@
       <w:pPr>
         <w:spacing w:after="0" w:before="0" w:line="240" w:lineRule="auto"/>
         <w:jc w:val="both"/>
+        <w:widowControl w:val="1"/>
+        <w:keepNext/>
+        <w:keepLines/>
         <w:rPr>
           <w:rFonts w:ascii="Century Gothic" w:hAnsi="Century Gothic" w:cs="Arial"/>
           <w:b/>
@@ -1232,6 +1263,9 @@
       <w:pPr>
         <w:spacing w:after="0" w:before="0" w:line="240" w:lineRule="auto"/>
         <w:jc w:val="both"/>
+        <w:widowControl w:val="1"/>
+        <w:keepNext/>
+        <w:keepLines/>
         <w:rPr>
           <w:rFonts w:ascii="Century Gothic" w:hAnsi="Century Gothic" w:cs="Arial"/>
         </w:rPr>
@@ -1248,6 +1282,8 @@
       <w:pPr>
         <w:spacing w:after="0" w:before="0" w:line="240" w:lineRule="auto"/>
         <w:jc w:val="both"/>
+        <w:widowControl w:val="1"/>
+        <w:keepLines/>
         <w:rPr>
           <w:rFonts w:ascii="Century Gothic" w:hAnsi="Century Gothic" w:cs="Arial"/>
         </w:rPr>
@@ -1264,6 +1300,7 @@
       <w:pPr>
         <w:spacing w:after="0" w:before="0" w:line="240" w:lineRule="auto"/>
         <w:jc w:val="both"/>
+        <w:widowControl w:val="1"/>
         <w:rPr>
           <w:rFonts w:ascii="Century Gothic" w:hAnsi="Century Gothic"/>
         </w:rPr>

</xml_diff>